<commit_message>
Advance secretary document generator
</commit_message>
<xml_diff>
--- a/app/doc_templates/p1_standard_v3_part1/08_rorc_notice_controller_standard.docx
+++ b/app/doc_templates/p1_standard_v3_part1/08_rorc_notice_controller_standard.docx
@@ -723,73 +723,6 @@
     </w:p>
     <w:p>
       <w:pPr>
-        <w:spacing w:before="320" w:after="520"/>
-      </w:pPr>
-      <w:r>
-        <w:rPr>
-          <w:rFonts w:ascii="Arial" w:hAnsi="Arial" w:eastAsia="Microsoft YaHei"/>
-          <w:b w:val="0"/>
-          <w:i w:val="0"/>
-        </w:rPr>
-        <w:t>Yours sincerely,</w:t>
-      </w:r>
-    </w:p>
-    <w:p>
-      <w:pPr>
-        <w:spacing w:after="40"/>
-      </w:pPr>
-      <w:r>
-        <w:rPr>
-          <w:rFonts w:ascii="Arial" w:hAnsi="Arial" w:eastAsia="Microsoft YaHei"/>
-          <w:b w:val="0"/>
-          <w:i w:val="0"/>
-        </w:rPr>
-        <w:t>______________________________</w:t>
-      </w:r>
-    </w:p>
-    <w:p>
-      <w:pPr>
-        <w:spacing w:after="0"/>
-      </w:pPr>
-      <w:r>
-        <w:rPr>
-          <w:rFonts w:ascii="Arial" w:hAnsi="Arial" w:eastAsia="Microsoft YaHei"/>
-          <w:b/>
-          <w:i w:val="0"/>
-        </w:rPr>
-        <w:t>{{secretary.full_name}}</w:t>
-      </w:r>
-    </w:p>
-    <w:p>
-      <w:pPr>
-        <w:spacing w:after="320"/>
-      </w:pPr>
-      <w:r>
-        <w:rPr>
-          <w:rFonts w:ascii="Arial" w:hAnsi="Arial" w:eastAsia="Microsoft YaHei"/>
-          <w:b/>
-          <w:i w:val="0"/>
-        </w:rPr>
-        <w:t>Secretary</w:t>
-      </w:r>
-    </w:p>
-    <w:p>
-      <w:pPr>
-        <w:spacing w:after="200"/>
-        <w:pBdr>
-          <w:bottom w:val="single" w:sz="8" w:space="1" w:color="9AA6B2"/>
-        </w:pBdr>
-      </w:pPr>
-      <w:r>
-        <w:rPr>
-          <w:rFonts w:ascii="Arial" w:hAnsi="Arial" w:eastAsia="Microsoft YaHei"/>
-          <w:b w:val="0"/>
-          <w:i w:val="0"/>
-        </w:rPr>
-      </w:r>
-    </w:p>
-    <w:p>
-      <w:pPr>
         <w:spacing w:after="560"/>
       </w:pPr>
       <w:r>

</xml_diff>